<commit_message>
Add class(python) for classroom api
</commit_message>
<xml_diff>
--- a/tests/files/crits.docx
+++ b/tests/files/crits.docx
@@ -309,313 +309,349 @@
       </w:r>
     </w:p>
     <w:p>
+      <w:pPr>
+        <w:rPr>
+          <w:rFonts w:ascii="Courier New" w:hAnsi="Courier New" w:cs="Courier New"/>
+          <w:sz w:val="26"/>
+          <w:szCs w:val="26"/>
+          <w:shd w:val="clear" w:color="auto" w:fill="FFFFFF"/>
+        </w:rPr>
+      </w:pPr>
+      <w:r>
+        <w:rPr>
+          <w:rStyle w:val="markedcontent"/>
+          <w:rFonts w:ascii="Courier New" w:hAnsi="Courier New" w:cs="Courier New"/>
+          <w:sz w:val="26"/>
+          <w:szCs w:val="26"/>
+          <w:shd w:val="clear" w:color="auto" w:fill="FFFFFF"/>
+        </w:rPr>
+        <w:t xml:space="preserve">  </w:t>
+      </w:r>
+      <w:r>
+        <w:rPr>
+          <w:rFonts w:ascii="Arial" w:hAnsi="Arial" w:cs="Arial"/>
+          <w:shd w:val="clear" w:color="auto" w:fill="FFFFFF"/>
+        </w:rPr>
+        <w:br/>
+      </w:r>
       <w:bookmarkStart w:id="0" w:name="_GoBack"/>
+      <w:r>
+        <w:rPr>
+          <w:rStyle w:val="markedcontent"/>
+          <w:rFonts w:ascii="Arial" w:hAnsi="Arial" w:cs="Arial"/>
+          <w:sz w:val="26"/>
+          <w:szCs w:val="26"/>
+          <w:shd w:val="clear" w:color="auto" w:fill="FFFFFF"/>
+        </w:rPr>
+        <w:t>Роботу потрібно оцінити за 10 бальною шкалою, на кожен пункт умови виділено по 2 бали:</w:t>
+      </w:r>
+      <w:r>
+        <w:rPr>
+          <w:rStyle w:val="markedcontent"/>
+          <w:rFonts w:ascii="Courier New" w:hAnsi="Courier New" w:cs="Courier New"/>
+          <w:sz w:val="26"/>
+          <w:szCs w:val="26"/>
+          <w:shd w:val="clear" w:color="auto" w:fill="FFFFFF"/>
+        </w:rPr>
+        <w:t xml:space="preserve"> </w:t>
+      </w:r>
+      <w:r>
+        <w:rPr>
+          <w:rFonts w:ascii="Arial" w:hAnsi="Arial" w:cs="Arial"/>
+          <w:shd w:val="clear" w:color="auto" w:fill="FFFFFF"/>
+        </w:rPr>
+        <w:br/>
+      </w:r>
+      <w:r>
+        <w:rPr>
+          <w:rStyle w:val="markedcontent"/>
+          <w:rFonts w:ascii="Arial" w:hAnsi="Arial" w:cs="Arial"/>
+          <w:sz w:val="26"/>
+          <w:szCs w:val="26"/>
+          <w:shd w:val="clear" w:color="auto" w:fill="FFFFFF"/>
+        </w:rPr>
+        <w:t xml:space="preserve">1. </w:t>
+      </w:r>
+      <w:r>
+        <w:rPr>
+          <w:rStyle w:val="markedcontent"/>
+          <w:rFonts w:ascii="Arial" w:hAnsi="Arial" w:cs="Arial"/>
+          <w:sz w:val="26"/>
+          <w:szCs w:val="26"/>
+          <w:shd w:val="clear" w:color="auto" w:fill="FFFFFF"/>
+        </w:rPr>
+        <w:t>Пункт 1: 2 бали, я</w:t>
+      </w:r>
+      <w:r>
+        <w:rPr>
+          <w:rStyle w:val="markedcontent"/>
+          <w:rFonts w:ascii="Arial" w:hAnsi="Arial" w:cs="Arial"/>
+          <w:sz w:val="26"/>
+          <w:szCs w:val="26"/>
+          <w:shd w:val="clear" w:color="auto" w:fill="FFFFFF"/>
+        </w:rPr>
+        <w:t>кщо тема сформована чітко,</w:t>
+      </w:r>
+      <w:r>
+        <w:rPr>
+          <w:rStyle w:val="markedcontent"/>
+          <w:rFonts w:ascii="Arial" w:hAnsi="Arial" w:cs="Arial"/>
+          <w:sz w:val="26"/>
+          <w:szCs w:val="26"/>
+          <w:shd w:val="clear" w:color="auto" w:fill="FFFFFF"/>
+        </w:rPr>
+        <w:t xml:space="preserve"> </w:t>
+      </w:r>
+      <w:proofErr w:type="spellStart"/>
+      <w:r>
+        <w:rPr>
+          <w:rStyle w:val="markedcontent"/>
+          <w:rFonts w:ascii="Arial" w:hAnsi="Arial" w:cs="Arial"/>
+          <w:sz w:val="26"/>
+          <w:szCs w:val="26"/>
+          <w:shd w:val="clear" w:color="auto" w:fill="FFFFFF"/>
+        </w:rPr>
+        <w:t>пояснено</w:t>
+      </w:r>
+      <w:proofErr w:type="spellEnd"/>
+      <w:r>
+        <w:rPr>
+          <w:rStyle w:val="markedcontent"/>
+          <w:rFonts w:ascii="Arial" w:hAnsi="Arial" w:cs="Arial"/>
+          <w:sz w:val="26"/>
+          <w:szCs w:val="26"/>
+          <w:shd w:val="clear" w:color="auto" w:fill="FFFFFF"/>
+        </w:rPr>
+        <w:t xml:space="preserve"> її актуальність; 1 бал, якщо тема сформована поверхнево чи надто загально; 0 балів, якщо тема не сформована чи відсутня</w:t>
+      </w:r>
+      <w:r>
+        <w:rPr>
+          <w:rStyle w:val="markedcontent"/>
+          <w:rFonts w:ascii="Courier New" w:hAnsi="Courier New" w:cs="Courier New"/>
+          <w:sz w:val="26"/>
+          <w:szCs w:val="26"/>
+          <w:shd w:val="clear" w:color="auto" w:fill="FFFFFF"/>
+        </w:rPr>
+        <w:t xml:space="preserve"> </w:t>
+      </w:r>
+      <w:r>
+        <w:rPr>
+          <w:rStyle w:val="markedcontent"/>
+          <w:rFonts w:ascii="Courier New" w:hAnsi="Courier New" w:cs="Courier New"/>
+          <w:sz w:val="26"/>
+          <w:szCs w:val="26"/>
+          <w:shd w:val="clear" w:color="auto" w:fill="FFFFFF"/>
+        </w:rPr>
+        <w:br/>
+      </w:r>
+      <w:r>
+        <w:rPr>
+          <w:rStyle w:val="markedcontent"/>
+          <w:rFonts w:ascii="Arial" w:hAnsi="Arial" w:cs="Arial"/>
+          <w:sz w:val="26"/>
+          <w:szCs w:val="26"/>
+          <w:shd w:val="clear" w:color="auto" w:fill="FFFFFF"/>
+        </w:rPr>
+        <w:t xml:space="preserve">2. </w:t>
+      </w:r>
+      <w:r>
+        <w:rPr>
+          <w:rStyle w:val="markedcontent"/>
+          <w:rFonts w:ascii="Arial" w:hAnsi="Arial" w:cs="Arial"/>
+          <w:sz w:val="26"/>
+          <w:szCs w:val="26"/>
+          <w:shd w:val="clear" w:color="auto" w:fill="FFFFFF"/>
+        </w:rPr>
+        <w:t xml:space="preserve">Пункт 2: 2 бали, якщо наукових джерел 3 і більше; 1 бал, якщо наукових джерел від 1 до 2; 0 балів, якщо наукових джерел у </w:t>
+      </w:r>
+      <w:proofErr w:type="spellStart"/>
+      <w:r>
+        <w:rPr>
+          <w:rStyle w:val="markedcontent"/>
+          <w:rFonts w:ascii="Arial" w:hAnsi="Arial" w:cs="Arial"/>
+          <w:sz w:val="26"/>
+          <w:szCs w:val="26"/>
+          <w:shd w:val="clear" w:color="auto" w:fill="FFFFFF"/>
+        </w:rPr>
+        <w:t>пункці</w:t>
+      </w:r>
+      <w:proofErr w:type="spellEnd"/>
+      <w:r>
+        <w:rPr>
+          <w:rStyle w:val="markedcontent"/>
+          <w:rFonts w:ascii="Arial" w:hAnsi="Arial" w:cs="Arial"/>
+          <w:sz w:val="26"/>
+          <w:szCs w:val="26"/>
+          <w:shd w:val="clear" w:color="auto" w:fill="FFFFFF"/>
+        </w:rPr>
+        <w:t xml:space="preserve"> відсутні</w:t>
+      </w:r>
+      <w:r>
+        <w:rPr>
+          <w:rStyle w:val="markedcontent"/>
+          <w:rFonts w:ascii="Courier New" w:hAnsi="Courier New" w:cs="Courier New"/>
+          <w:sz w:val="26"/>
+          <w:szCs w:val="26"/>
+          <w:shd w:val="clear" w:color="auto" w:fill="FFFFFF"/>
+        </w:rPr>
+        <w:t xml:space="preserve"> </w:t>
+      </w:r>
+      <w:r>
+        <w:rPr>
+          <w:rFonts w:ascii="Arial" w:hAnsi="Arial" w:cs="Arial"/>
+          <w:shd w:val="clear" w:color="auto" w:fill="FFFFFF"/>
+        </w:rPr>
+        <w:br/>
+      </w:r>
+      <w:r>
+        <w:rPr>
+          <w:rStyle w:val="markedcontent"/>
+          <w:rFonts w:ascii="Arial" w:hAnsi="Arial" w:cs="Arial"/>
+          <w:sz w:val="26"/>
+          <w:szCs w:val="26"/>
+          <w:shd w:val="clear" w:color="auto" w:fill="FFFFFF"/>
+        </w:rPr>
+        <w:t xml:space="preserve">3. Пункт 3: 2 бали, якщо виділено 3 і більше підходів чи принципів, пов'язаних із темою і вони </w:t>
+      </w:r>
+      <w:proofErr w:type="spellStart"/>
+      <w:r>
+        <w:rPr>
+          <w:rStyle w:val="markedcontent"/>
+          <w:rFonts w:ascii="Arial" w:hAnsi="Arial" w:cs="Arial"/>
+          <w:sz w:val="26"/>
+          <w:szCs w:val="26"/>
+          <w:shd w:val="clear" w:color="auto" w:fill="FFFFFF"/>
+        </w:rPr>
+        <w:t>вичерпно</w:t>
+      </w:r>
+      <w:proofErr w:type="spellEnd"/>
+      <w:r>
+        <w:rPr>
+          <w:rStyle w:val="markedcontent"/>
+          <w:rFonts w:ascii="Arial" w:hAnsi="Arial" w:cs="Arial"/>
+          <w:sz w:val="26"/>
+          <w:szCs w:val="26"/>
+          <w:shd w:val="clear" w:color="auto" w:fill="FFFFFF"/>
+        </w:rPr>
+        <w:t xml:space="preserve"> пояснені; 1 бал, якщо вказано менше 1 чи 2 підходи, які пояснені поверхнево; 0 балів, якщо підходи і принципи у пункті відсутні.</w:t>
+      </w:r>
+      <w:r>
+        <w:rPr>
+          <w:rStyle w:val="markedcontent"/>
+          <w:rFonts w:ascii="Courier New" w:hAnsi="Courier New" w:cs="Courier New"/>
+          <w:sz w:val="26"/>
+          <w:szCs w:val="26"/>
+          <w:shd w:val="clear" w:color="auto" w:fill="FFFFFF"/>
+        </w:rPr>
+        <w:t xml:space="preserve"> </w:t>
+      </w:r>
+      <w:r>
+        <w:rPr>
+          <w:rFonts w:ascii="Arial" w:hAnsi="Arial" w:cs="Arial"/>
+          <w:shd w:val="clear" w:color="auto" w:fill="FFFFFF"/>
+        </w:rPr>
+        <w:br/>
+      </w:r>
+      <w:r>
+        <w:rPr>
+          <w:rStyle w:val="markedcontent"/>
+          <w:rFonts w:ascii="Arial" w:hAnsi="Arial" w:cs="Arial"/>
+          <w:sz w:val="26"/>
+          <w:szCs w:val="26"/>
+          <w:shd w:val="clear" w:color="auto" w:fill="FFFFFF"/>
+        </w:rPr>
+        <w:t xml:space="preserve">4. Пункт 4: 2 бали, якщо виділено 3 і більше проблемних питання чи гіпотез дослідження, описано що саме потрібно в них вирішити, </w:t>
+      </w:r>
+      <w:r>
+        <w:rPr>
+          <w:rStyle w:val="markedcontent"/>
+          <w:rFonts w:ascii="Courier New" w:hAnsi="Courier New" w:cs="Courier New"/>
+          <w:sz w:val="26"/>
+          <w:szCs w:val="26"/>
+          <w:shd w:val="clear" w:color="auto" w:fill="FFFFFF"/>
+        </w:rPr>
+        <w:t xml:space="preserve"> </w:t>
+      </w:r>
+      <w:r>
+        <w:rPr>
+          <w:rStyle w:val="markedcontent"/>
+          <w:rFonts w:ascii="Arial" w:hAnsi="Arial" w:cs="Arial"/>
+          <w:sz w:val="26"/>
+          <w:szCs w:val="26"/>
+          <w:shd w:val="clear" w:color="auto" w:fill="FFFFFF"/>
+        </w:rPr>
+        <w:t>1 бал, якщо проблемних питань чи гіпотез вказано 1 чи 2 і вони описані поверхнево; 0 балів, якщо проблемні питання чи гіпотези відсутні</w:t>
+      </w:r>
+      <w:r>
+        <w:rPr>
+          <w:rStyle w:val="markedcontent"/>
+          <w:rFonts w:ascii="Courier New" w:hAnsi="Courier New" w:cs="Courier New"/>
+          <w:sz w:val="26"/>
+          <w:szCs w:val="26"/>
+          <w:shd w:val="clear" w:color="auto" w:fill="FFFFFF"/>
+        </w:rPr>
+        <w:t xml:space="preserve"> </w:t>
+      </w:r>
+      <w:r>
+        <w:rPr>
+          <w:rFonts w:ascii="Arial" w:hAnsi="Arial" w:cs="Arial"/>
+          <w:shd w:val="clear" w:color="auto" w:fill="FFFFFF"/>
+        </w:rPr>
+        <w:br/>
+      </w:r>
+      <w:r>
+        <w:rPr>
+          <w:rStyle w:val="markedcontent"/>
+          <w:rFonts w:ascii="Arial" w:hAnsi="Arial" w:cs="Arial"/>
+          <w:sz w:val="26"/>
+          <w:szCs w:val="26"/>
+          <w:shd w:val="clear" w:color="auto" w:fill="FFFFFF"/>
+        </w:rPr>
+        <w:t>5. Пункт 5: 2 бали, якщо запропоновано не менше 3</w:t>
+      </w:r>
+      <w:r>
+        <w:rPr>
+          <w:rStyle w:val="markedcontent"/>
+          <w:rFonts w:ascii="Courier New" w:hAnsi="Courier New" w:cs="Courier New"/>
+          <w:sz w:val="26"/>
+          <w:szCs w:val="26"/>
+          <w:shd w:val="clear" w:color="auto" w:fill="FFFFFF"/>
+        </w:rPr>
+        <w:t>-</w:t>
+      </w:r>
+      <w:r>
+        <w:rPr>
+          <w:rStyle w:val="markedcontent"/>
+          <w:rFonts w:ascii="Arial" w:hAnsi="Arial" w:cs="Arial"/>
+          <w:sz w:val="26"/>
+          <w:szCs w:val="26"/>
+          <w:shd w:val="clear" w:color="auto" w:fill="FFFFFF"/>
+        </w:rPr>
+        <w:t xml:space="preserve">4 новітніх ідеї чи концептуальних підходів, наявний опис того як мають </w:t>
+      </w:r>
+      <w:proofErr w:type="spellStart"/>
+      <w:r>
+        <w:rPr>
+          <w:rStyle w:val="markedcontent"/>
+          <w:rFonts w:ascii="Arial" w:hAnsi="Arial" w:cs="Arial"/>
+          <w:sz w:val="26"/>
+          <w:szCs w:val="26"/>
+          <w:shd w:val="clear" w:color="auto" w:fill="FFFFFF"/>
+        </w:rPr>
+        <w:t>мають</w:t>
+      </w:r>
+      <w:proofErr w:type="spellEnd"/>
+      <w:r>
+        <w:rPr>
+          <w:rStyle w:val="markedcontent"/>
+          <w:rFonts w:ascii="Arial" w:hAnsi="Arial" w:cs="Arial"/>
+          <w:sz w:val="26"/>
+          <w:szCs w:val="26"/>
+          <w:shd w:val="clear" w:color="auto" w:fill="FFFFFF"/>
+        </w:rPr>
+        <w:t xml:space="preserve"> працювати ці підходи, опис може бути не надто детальним, але суть описаних підходів має бути зрозуміла; 1 бал, якщо описано 1 чи 2 підходи, опис загальний, не описано як саме мають працювати підходи; 0 балів, якщо підходи не описані чи відсутні</w:t>
+      </w:r>
       <w:bookmarkEnd w:id="0"/>
-      <w:r>
-        <w:rPr>
-          <w:rStyle w:val="markedcontent"/>
-          <w:rFonts w:ascii="Courier New" w:hAnsi="Courier New" w:cs="Courier New"/>
-          <w:sz w:val="26"/>
-          <w:szCs w:val="26"/>
-          <w:shd w:val="clear" w:color="auto" w:fill="FFFFFF"/>
-        </w:rPr>
-        <w:t xml:space="preserve">  </w:t>
-      </w:r>
-      <w:r>
-        <w:rPr>
-          <w:rFonts w:ascii="Arial" w:hAnsi="Arial" w:cs="Arial"/>
-          <w:shd w:val="clear" w:color="auto" w:fill="FFFFFF"/>
-        </w:rPr>
-        <w:br/>
-      </w:r>
-      <w:r>
-        <w:rPr>
-          <w:rStyle w:val="markedcontent"/>
-          <w:rFonts w:ascii="Arial" w:hAnsi="Arial" w:cs="Arial"/>
-          <w:sz w:val="26"/>
-          <w:szCs w:val="26"/>
-          <w:shd w:val="clear" w:color="auto" w:fill="FFFFFF"/>
-        </w:rPr>
-        <w:t>Роботу потрібно оцінити за 10 бальною шкалою, на кожен пункт умови виділено по 2 бали:</w:t>
-      </w:r>
-      <w:r>
-        <w:rPr>
-          <w:rStyle w:val="markedcontent"/>
-          <w:rFonts w:ascii="Courier New" w:hAnsi="Courier New" w:cs="Courier New"/>
-          <w:sz w:val="26"/>
-          <w:szCs w:val="26"/>
-          <w:shd w:val="clear" w:color="auto" w:fill="FFFFFF"/>
-        </w:rPr>
-        <w:t xml:space="preserve"> </w:t>
-      </w:r>
-      <w:r>
-        <w:rPr>
-          <w:rFonts w:ascii="Arial" w:hAnsi="Arial" w:cs="Arial"/>
-          <w:shd w:val="clear" w:color="auto" w:fill="FFFFFF"/>
-        </w:rPr>
-        <w:br/>
-      </w:r>
-      <w:r>
-        <w:rPr>
-          <w:rStyle w:val="markedcontent"/>
-          <w:rFonts w:ascii="Arial" w:hAnsi="Arial" w:cs="Arial"/>
-          <w:sz w:val="26"/>
-          <w:szCs w:val="26"/>
-          <w:shd w:val="clear" w:color="auto" w:fill="FFFFFF"/>
-        </w:rPr>
-        <w:t xml:space="preserve">1. Пункт 1: 2 бали, якщо тема сформована чітко, </w:t>
-      </w:r>
-      <w:proofErr w:type="spellStart"/>
-      <w:r>
-        <w:rPr>
-          <w:rStyle w:val="markedcontent"/>
-          <w:rFonts w:ascii="Arial" w:hAnsi="Arial" w:cs="Arial"/>
-          <w:sz w:val="26"/>
-          <w:szCs w:val="26"/>
-          <w:shd w:val="clear" w:color="auto" w:fill="FFFFFF"/>
-        </w:rPr>
-        <w:t>такоє</w:t>
-      </w:r>
-      <w:proofErr w:type="spellEnd"/>
-      <w:r>
-        <w:rPr>
-          <w:rStyle w:val="markedcontent"/>
-          <w:rFonts w:ascii="Arial" w:hAnsi="Arial" w:cs="Arial"/>
-          <w:sz w:val="26"/>
-          <w:szCs w:val="26"/>
-          <w:shd w:val="clear" w:color="auto" w:fill="FFFFFF"/>
-        </w:rPr>
-        <w:t xml:space="preserve"> </w:t>
-      </w:r>
-      <w:proofErr w:type="spellStart"/>
-      <w:r>
-        <w:rPr>
-          <w:rStyle w:val="markedcontent"/>
-          <w:rFonts w:ascii="Arial" w:hAnsi="Arial" w:cs="Arial"/>
-          <w:sz w:val="26"/>
-          <w:szCs w:val="26"/>
-          <w:shd w:val="clear" w:color="auto" w:fill="FFFFFF"/>
-        </w:rPr>
-        <w:t>пояснено</w:t>
-      </w:r>
-      <w:proofErr w:type="spellEnd"/>
-      <w:r>
-        <w:rPr>
-          <w:rStyle w:val="markedcontent"/>
-          <w:rFonts w:ascii="Arial" w:hAnsi="Arial" w:cs="Arial"/>
-          <w:sz w:val="26"/>
-          <w:szCs w:val="26"/>
-          <w:shd w:val="clear" w:color="auto" w:fill="FFFFFF"/>
-        </w:rPr>
-        <w:t xml:space="preserve"> її актуальність; 1 бал, якщо тема сформована поверхнево чи надто загально; 0 балів, якщо тема не сформована чи відсутня</w:t>
-      </w:r>
-      <w:r>
-        <w:rPr>
-          <w:rStyle w:val="markedcontent"/>
-          <w:rFonts w:ascii="Courier New" w:hAnsi="Courier New" w:cs="Courier New"/>
-          <w:sz w:val="26"/>
-          <w:szCs w:val="26"/>
-          <w:shd w:val="clear" w:color="auto" w:fill="FFFFFF"/>
-        </w:rPr>
-        <w:t xml:space="preserve"> 2. </w:t>
-      </w:r>
-      <w:r>
-        <w:rPr>
-          <w:rStyle w:val="markedcontent"/>
-          <w:rFonts w:ascii="Arial" w:hAnsi="Arial" w:cs="Arial"/>
-          <w:sz w:val="26"/>
-          <w:szCs w:val="26"/>
-          <w:shd w:val="clear" w:color="auto" w:fill="FFFFFF"/>
-        </w:rPr>
-        <w:t xml:space="preserve">Пункт 2: 2 бали, якщо наукових джерел 3 і більше; 1 бал, якщо наукових джерел від 1 до 2; 0 балів, якщо наукових джерел у </w:t>
-      </w:r>
-      <w:proofErr w:type="spellStart"/>
-      <w:r>
-        <w:rPr>
-          <w:rStyle w:val="markedcontent"/>
-          <w:rFonts w:ascii="Arial" w:hAnsi="Arial" w:cs="Arial"/>
-          <w:sz w:val="26"/>
-          <w:szCs w:val="26"/>
-          <w:shd w:val="clear" w:color="auto" w:fill="FFFFFF"/>
-        </w:rPr>
-        <w:t>пункці</w:t>
-      </w:r>
-      <w:proofErr w:type="spellEnd"/>
-      <w:r>
-        <w:rPr>
-          <w:rStyle w:val="markedcontent"/>
-          <w:rFonts w:ascii="Arial" w:hAnsi="Arial" w:cs="Arial"/>
-          <w:sz w:val="26"/>
-          <w:szCs w:val="26"/>
-          <w:shd w:val="clear" w:color="auto" w:fill="FFFFFF"/>
-        </w:rPr>
-        <w:t xml:space="preserve"> відсутні</w:t>
-      </w:r>
-      <w:r>
-        <w:rPr>
-          <w:rStyle w:val="markedcontent"/>
-          <w:rFonts w:ascii="Courier New" w:hAnsi="Courier New" w:cs="Courier New"/>
-          <w:sz w:val="26"/>
-          <w:szCs w:val="26"/>
-          <w:shd w:val="clear" w:color="auto" w:fill="FFFFFF"/>
-        </w:rPr>
-        <w:t xml:space="preserve"> </w:t>
-      </w:r>
-      <w:r>
-        <w:rPr>
-          <w:rFonts w:ascii="Arial" w:hAnsi="Arial" w:cs="Arial"/>
-          <w:shd w:val="clear" w:color="auto" w:fill="FFFFFF"/>
-        </w:rPr>
-        <w:br/>
-      </w:r>
-      <w:r>
-        <w:rPr>
-          <w:rStyle w:val="markedcontent"/>
-          <w:rFonts w:ascii="Arial" w:hAnsi="Arial" w:cs="Arial"/>
-          <w:sz w:val="26"/>
-          <w:szCs w:val="26"/>
-          <w:shd w:val="clear" w:color="auto" w:fill="FFFFFF"/>
-        </w:rPr>
-        <w:t xml:space="preserve">3. Пункт 3: 2 бали, якщо виділено 3 і більше підходів чи принципів, пов'язаних із темою і вони </w:t>
-      </w:r>
-      <w:proofErr w:type="spellStart"/>
-      <w:r>
-        <w:rPr>
-          <w:rStyle w:val="markedcontent"/>
-          <w:rFonts w:ascii="Arial" w:hAnsi="Arial" w:cs="Arial"/>
-          <w:sz w:val="26"/>
-          <w:szCs w:val="26"/>
-          <w:shd w:val="clear" w:color="auto" w:fill="FFFFFF"/>
-        </w:rPr>
-        <w:t>вичерпно</w:t>
-      </w:r>
-      <w:proofErr w:type="spellEnd"/>
-      <w:r>
-        <w:rPr>
-          <w:rStyle w:val="markedcontent"/>
-          <w:rFonts w:ascii="Arial" w:hAnsi="Arial" w:cs="Arial"/>
-          <w:sz w:val="26"/>
-          <w:szCs w:val="26"/>
-          <w:shd w:val="clear" w:color="auto" w:fill="FFFFFF"/>
-        </w:rPr>
-        <w:t xml:space="preserve"> пояснені; 1 бал, якщо вказано менше 1 чи 2 підходи, які пояснені поверхнево; 0 балів, якщо підходи і принципи у пункті відсутні.</w:t>
-      </w:r>
-      <w:r>
-        <w:rPr>
-          <w:rStyle w:val="markedcontent"/>
-          <w:rFonts w:ascii="Courier New" w:hAnsi="Courier New" w:cs="Courier New"/>
-          <w:sz w:val="26"/>
-          <w:szCs w:val="26"/>
-          <w:shd w:val="clear" w:color="auto" w:fill="FFFFFF"/>
-        </w:rPr>
-        <w:t xml:space="preserve"> </w:t>
-      </w:r>
-      <w:r>
-        <w:rPr>
-          <w:rFonts w:ascii="Arial" w:hAnsi="Arial" w:cs="Arial"/>
-          <w:shd w:val="clear" w:color="auto" w:fill="FFFFFF"/>
-        </w:rPr>
-        <w:br/>
-      </w:r>
-      <w:r>
-        <w:rPr>
-          <w:rStyle w:val="markedcontent"/>
-          <w:rFonts w:ascii="Arial" w:hAnsi="Arial" w:cs="Arial"/>
-          <w:sz w:val="26"/>
-          <w:szCs w:val="26"/>
-          <w:shd w:val="clear" w:color="auto" w:fill="FFFFFF"/>
-        </w:rPr>
-        <w:t xml:space="preserve">4. Пункт 4: 2 бали, якщо виділено 3 і більше проблемних питання чи гіпотез дослідження, описано що саме потрібно в них вирішити, </w:t>
-      </w:r>
-      <w:r>
-        <w:rPr>
-          <w:rStyle w:val="markedcontent"/>
-          <w:rFonts w:ascii="Courier New" w:hAnsi="Courier New" w:cs="Courier New"/>
-          <w:sz w:val="26"/>
-          <w:szCs w:val="26"/>
-          <w:shd w:val="clear" w:color="auto" w:fill="FFFFFF"/>
-        </w:rPr>
-        <w:t xml:space="preserve"> </w:t>
-      </w:r>
-      <w:r>
-        <w:rPr>
-          <w:rStyle w:val="markedcontent"/>
-          <w:rFonts w:ascii="Arial" w:hAnsi="Arial" w:cs="Arial"/>
-          <w:sz w:val="26"/>
-          <w:szCs w:val="26"/>
-          <w:shd w:val="clear" w:color="auto" w:fill="FFFFFF"/>
-        </w:rPr>
-        <w:t>1 бал, якщо проблемних питань чи гіпотез вказано 1 чи 2 і вони описані поверхнево; 0 балів, якщо проблемні питання чи гіпотези відсутні</w:t>
-      </w:r>
-      <w:r>
-        <w:rPr>
-          <w:rStyle w:val="markedcontent"/>
-          <w:rFonts w:ascii="Courier New" w:hAnsi="Courier New" w:cs="Courier New"/>
-          <w:sz w:val="26"/>
-          <w:szCs w:val="26"/>
-          <w:shd w:val="clear" w:color="auto" w:fill="FFFFFF"/>
-        </w:rPr>
-        <w:t xml:space="preserve"> </w:t>
-      </w:r>
-      <w:r>
-        <w:rPr>
-          <w:rFonts w:ascii="Arial" w:hAnsi="Arial" w:cs="Arial"/>
-          <w:shd w:val="clear" w:color="auto" w:fill="FFFFFF"/>
-        </w:rPr>
-        <w:br/>
-      </w:r>
-      <w:r>
-        <w:rPr>
-          <w:rStyle w:val="markedcontent"/>
-          <w:rFonts w:ascii="Arial" w:hAnsi="Arial" w:cs="Arial"/>
-          <w:sz w:val="26"/>
-          <w:szCs w:val="26"/>
-          <w:shd w:val="clear" w:color="auto" w:fill="FFFFFF"/>
-        </w:rPr>
-        <w:t>5. Пункт 5: 2 бали, якщо запропоновано не менше 3</w:t>
-      </w:r>
-      <w:r>
-        <w:rPr>
-          <w:rStyle w:val="markedcontent"/>
-          <w:rFonts w:ascii="Courier New" w:hAnsi="Courier New" w:cs="Courier New"/>
-          <w:sz w:val="26"/>
-          <w:szCs w:val="26"/>
-          <w:shd w:val="clear" w:color="auto" w:fill="FFFFFF"/>
-        </w:rPr>
-        <w:t>-</w:t>
-      </w:r>
-      <w:r>
-        <w:rPr>
-          <w:rStyle w:val="markedcontent"/>
-          <w:rFonts w:ascii="Arial" w:hAnsi="Arial" w:cs="Arial"/>
-          <w:sz w:val="26"/>
-          <w:szCs w:val="26"/>
-          <w:shd w:val="clear" w:color="auto" w:fill="FFFFFF"/>
-        </w:rPr>
-        <w:t xml:space="preserve">4 новітніх ідеї чи концептуальних підходів, наявний опис того як мають </w:t>
-      </w:r>
-      <w:proofErr w:type="spellStart"/>
-      <w:r>
-        <w:rPr>
-          <w:rStyle w:val="markedcontent"/>
-          <w:rFonts w:ascii="Arial" w:hAnsi="Arial" w:cs="Arial"/>
-          <w:sz w:val="26"/>
-          <w:szCs w:val="26"/>
-          <w:shd w:val="clear" w:color="auto" w:fill="FFFFFF"/>
-        </w:rPr>
-        <w:t>мають</w:t>
-      </w:r>
-      <w:proofErr w:type="spellEnd"/>
-      <w:r>
-        <w:rPr>
-          <w:rStyle w:val="markedcontent"/>
-          <w:rFonts w:ascii="Arial" w:hAnsi="Arial" w:cs="Arial"/>
-          <w:sz w:val="26"/>
-          <w:szCs w:val="26"/>
-          <w:shd w:val="clear" w:color="auto" w:fill="FFFFFF"/>
-        </w:rPr>
-        <w:t xml:space="preserve"> працювати ці підходи, опис може бути не надто детальним, але суть описаних підходів має бути зрозуміла; 1 бал, якщо описано 1 чи 2 підходи, опис загальний, не описано як саме мають працювати підходи; 0 балів, якщо підходи не описані чи відсутні</w:t>
-      </w:r>
     </w:p>
     <w:sectPr>
       <w:pgSz w:w="11906" w:h="16838"/>

</xml_diff>